<commit_message>
Replace additive-estimation slides with interpolation cost estimate and lead into sky-view method
Co-Authored-By: Claude Opus 5.5 <noreply@anthropic.com>
Claude-Session: https://claude.ai/code/session_016RiyjW2dcXEqTbVbvy54mh
</commit_message>
<xml_diff>
--- a/slides/発表原稿_19-36枚目.docx
+++ b/slides/発表原稿_19-36枚目.docx
@@ -47,7 +47,7 @@
           <w:sz w:val="20"/>
           <w:szCs w:val="20"/>
         </w:rPr>
-        <w:t xml:space="preserve">全18枚・読み上げの目安 約19分（1分あたり約300字で計算）</w:t>
+        <w:t xml:space="preserve">全18枚・読み上げの目安 約20分（1分あたり約300字で計算）</w:t>
       </w:r>
     </w:p>
     <w:p>
@@ -64,7 +64,7 @@
           <w:sz w:val="20"/>
           <w:szCs w:val="20"/>
         </w:rPr>
-        <w:t xml:space="preserve">※ 30〜32枚目の 1000・700・900・600・640 と時間帯、34枚目の低い建物の値は説明用の仮の値です。29枚目の「1回10分」も仮の値なので、実際のSEBEの計算時間に置き換えてください。</w:t>
+        <w:t xml:space="preserve">※ 31枚目の保存値600と、34枚目の低い建物の値は説明用の仮の値です。計算時間は、SEBE 1回を30秒〜1分として見積もっています。</w:t>
       </w:r>
     </w:p>
     <w:p>
@@ -108,7 +108,7 @@
           <w:sz w:val="18"/>
           <w:szCs w:val="18"/>
         </w:rPr>
-        <w:t xml:space="preserve">読み上げ目安：約1分（267字）</w:t>
+        <w:t xml:space="preserve">読み上げ目安：約1分（274字）</w:t>
       </w:r>
     </w:p>
     <w:p>
@@ -147,7 +147,7 @@
           <w:sz w:val="22"/>
           <w:szCs w:val="22"/>
         </w:rPr>
-        <w:t xml:space="preserve">これはPART 7で、なぜそのままでは難しいのか、代わりにどう進めるのかを説明し、PART 8で代案を紹介します。</w:t>
+        <w:t xml:space="preserve">これはPART 7で、線形補間で4方向のツールを作る場合の計算と計算時間を具体的に示し、PART 8で代わりの方法を紹介します。</w:t>
       </w:r>
     </w:p>
     <w:p>
@@ -866,7 +866,7 @@
           <w:sz w:val="24"/>
           <w:szCs w:val="24"/>
         </w:rPr>
-        <w:t xml:space="preserve">来週の対象：方位を北・東・南・西に固定した「4方向版」</w:t>
+        <w:t xml:space="preserve">まず考える対象：方位を北・東・南・西に固定した「4方向版」</w:t>
       </w:r>
     </w:p>
     <w:p>
@@ -881,33 +881,46 @@
           <w:sz w:val="18"/>
           <w:szCs w:val="18"/>
         </w:rPr>
-        <w:t xml:space="preserve">読み上げ目安：約30秒（201字）</w:t>
-      </w:r>
-    </w:p>
-    <w:p>
-      <w:pPr>
-        <w:spacing w:after="100" w:line="360"/>
-      </w:pPr>
-      <w:r>
-        <w:rPr>
-          <w:rFonts w:ascii="Yu Gothic" w:cs="Yu Gothic" w:eastAsia="Yu Gothic" w:hAnsi="Yu Gothic"/>
-          <w:sz w:val="22"/>
-          <w:szCs w:val="22"/>
-        </w:rPr>
-        <w:t xml:space="preserve">最終目標の17変数に一度に進むのではなく、来週はまず、方位を北・東・南・西に固定し、中央建物の高さも50mに固定した「4方向版」で試します。変える変数は、4方向それぞれの有無s、高さA、隙間Dの12個です。</w:t>
-      </w:r>
-    </w:p>
-    <w:p>
-      <w:pPr>
-        <w:spacing w:after="100" w:line="360"/>
-      </w:pPr>
-      <w:r>
-        <w:rPr>
-          <w:rFonts w:ascii="Yu Gothic" w:cs="Yu Gothic" w:eastAsia="Yu Gothic" w:hAnsi="Yu Gothic"/>
-          <w:sz w:val="22"/>
-          <w:szCs w:val="22"/>
-        </w:rPr>
-        <w:t xml:space="preserve">4方向というのは、必ず4棟置くという意味ではなく、各方向に0棟か1棟置けるという意味です。方位を固定すると、1方向ずつ見れば南1棟と同じAとDの2変数になるので、南で作った方法をそのまま使えます。</w:t>
+        <w:t xml:space="preserve">読み上げ目安：約1分（234字）</w:t>
+      </w:r>
+    </w:p>
+    <w:p>
+      <w:pPr>
+        <w:spacing w:after="100" w:line="360"/>
+      </w:pPr>
+      <w:r>
+        <w:rPr>
+          <w:rFonts w:ascii="Yu Gothic" w:cs="Yu Gothic" w:eastAsia="Yu Gothic" w:hAnsi="Yu Gothic"/>
+          <w:sz w:val="22"/>
+          <w:szCs w:val="22"/>
+        </w:rPr>
+        <w:t xml:space="preserve">最終目標の17変数に一度に進むのではなく、まず方位を北・東・南・西に固定し、中央建物の高さも50mに固定した「4方向版」で考えます。</w:t>
+      </w:r>
+    </w:p>
+    <w:p>
+      <w:pPr>
+        <w:spacing w:after="100" w:line="360"/>
+      </w:pPr>
+      <w:r>
+        <w:rPr>
+          <w:rFonts w:ascii="Yu Gothic" w:cs="Yu Gothic" w:eastAsia="Yu Gothic" w:hAnsi="Yu Gothic"/>
+          <w:sz w:val="22"/>
+          <w:szCs w:val="22"/>
+        </w:rPr>
+        <w:t xml:space="preserve">変える変数は4方向それぞれの有無s、高さA、隙間Dの12個で、そのうち連続して変わるのは高さと隙間の8個、有無は0か1の4個です。4方向というのは、必ず4棟置くという意味ではなく、各方向に0棟か1棟置けるという意味です。</w:t>
+      </w:r>
+    </w:p>
+    <w:p>
+      <w:pPr>
+        <w:spacing w:after="100" w:line="360"/>
+      </w:pPr>
+      <w:r>
+        <w:rPr>
+          <w:rFonts w:ascii="Yu Gothic" w:cs="Yu Gothic" w:eastAsia="Yu Gothic" w:hAnsi="Yu Gothic"/>
+          <w:sz w:val="22"/>
+          <w:szCs w:val="22"/>
+        </w:rPr>
+        <w:t xml:space="preserve">この4方向版で、線形補間でツールを作るとどれだけの計算が必要かを見積もれば、17変数に広げたときの見通しが立ちます。</w:t>
       </w:r>
     </w:p>
     <w:p>
@@ -951,72 +964,59 @@
           <w:sz w:val="18"/>
           <w:szCs w:val="18"/>
         </w:rPr>
-        <w:t xml:space="preserve">読み上げ目安：約1.5分（407字）</w:t>
-      </w:r>
-    </w:p>
-    <w:p>
-      <w:pPr>
-        <w:spacing w:after="100" w:line="360"/>
-      </w:pPr>
-      <w:r>
-        <w:rPr>
-          <w:rFonts w:ascii="Yu Gothic" w:cs="Yu Gothic" w:eastAsia="Yu Gothic" w:hAnsi="Yu Gothic"/>
-          <w:sz w:val="22"/>
-          <w:szCs w:val="22"/>
-        </w:rPr>
-        <w:t xml:space="preserve">ここから、先生の「2変数を9点でできたなら、4方向でもできるのでは」というご質問にお答えします。南1棟では、高さ3通り×距離3通りの9通りで表を作れました。</w:t>
-      </w:r>
-    </w:p>
-    <w:p>
-      <w:pPr>
-        <w:spacing w:after="100" w:line="360"/>
-      </w:pPr>
-      <w:r>
-        <w:rPr>
-          <w:rFonts w:ascii="Yu Gothic" w:cs="Yu Gothic" w:eastAsia="Yu Gothic" w:hAnsi="Yu Gothic"/>
-          <w:sz w:val="22"/>
-          <w:szCs w:val="22"/>
-        </w:rPr>
-        <w:t xml:space="preserve">4方向では、北の建物の9通りのそれぞれについて東の建物の9通りがあり、さらに南、西と選び方が重なっていくので、9×9×9×9＝6,561通りになります。</w:t>
-      </w:r>
-    </w:p>
-    <w:p>
-      <w:pPr>
-        <w:spacing w:after="100" w:line="360"/>
-      </w:pPr>
-      <w:r>
-        <w:rPr>
-          <w:rFonts w:ascii="Yu Gothic" w:cs="Yu Gothic" w:eastAsia="Yu Gothic" w:hAnsi="Yu Gothic"/>
-          <w:sz w:val="22"/>
-          <w:szCs w:val="22"/>
-        </w:rPr>
-        <w:t xml:space="preserve">4桁の暗証番号が、各桁10通りで10×10×10×10＝1万通りあるのと同じ考え方で、4方向が4つの桁にあたります。建物がない場合も1通りとして数えると各方向10通りになるので、ちょうど1万通りです。</w:t>
-      </w:r>
-    </w:p>
-    <w:p>
-      <w:pPr>
-        <w:spacing w:after="100" w:line="360"/>
-      </w:pPr>
-      <w:r>
-        <w:rPr>
-          <w:rFonts w:ascii="Yu Gothic" w:cs="Yu Gothic" w:eastAsia="Yu Gothic" w:hAnsi="Yu Gothic"/>
-          <w:sz w:val="22"/>
-          <w:szCs w:val="22"/>
-        </w:rPr>
-        <w:t xml:space="preserve">もし6,561通りを全部SEBEで計算できれば、南1棟と同じように周りの点で補間でき、一番確実です。しかし、南1棟の研究全体で計算した47配置の約140倍の計算が必要で、仮に1回10分としても休まず約46日かかります。</w:t>
-      </w:r>
-    </w:p>
-    <w:p>
-      <w:pPr>
-        <w:spacing w:after="100" w:line="360"/>
-      </w:pPr>
-      <w:r>
-        <w:rPr>
-          <w:rFonts w:ascii="Yu Gothic" w:cs="Yu Gothic" w:eastAsia="Yu Gothic" w:hAnsi="Yu Gothic"/>
-          <w:sz w:val="22"/>
-          <w:szCs w:val="22"/>
-        </w:rPr>
-        <w:t xml:space="preserve">そのため、6,561通りは「全部やるとこうなる」という見積もりで、実際には計算しません。</w:t>
+        <w:t xml:space="preserve">読み上げ目安：約1分（327字）</w:t>
+      </w:r>
+    </w:p>
+    <w:p>
+      <w:pPr>
+        <w:spacing w:after="100" w:line="360"/>
+      </w:pPr>
+      <w:r>
+        <w:rPr>
+          <w:rFonts w:ascii="Yu Gothic" w:cs="Yu Gothic" w:eastAsia="Yu Gothic" w:hAnsi="Yu Gothic"/>
+          <w:sz w:val="22"/>
+          <w:szCs w:val="22"/>
+        </w:rPr>
+        <w:t xml:space="preserve">先生の「2変数を9点でできたなら、4方向でもできるのでは」というご質問にお答えします。南1棟では、高さ3通り×距離3通りの9通りで表を作れました。</w:t>
+      </w:r>
+    </w:p>
+    <w:p>
+      <w:pPr>
+        <w:spacing w:after="100" w:line="360"/>
+      </w:pPr>
+      <w:r>
+        <w:rPr>
+          <w:rFonts w:ascii="Yu Gothic" w:cs="Yu Gothic" w:eastAsia="Yu Gothic" w:hAnsi="Yu Gothic"/>
+          <w:sz w:val="22"/>
+          <w:szCs w:val="22"/>
+        </w:rPr>
+        <w:t xml:space="preserve">4方向では、北の建物の9通りのそれぞれについて東の9通りがあり、さらに南、西と選び方が重なるので、9×9×9×9＝6,561通りになります。</w:t>
+      </w:r>
+    </w:p>
+    <w:p>
+      <w:pPr>
+        <w:spacing w:after="100" w:line="360"/>
+      </w:pPr>
+      <w:r>
+        <w:rPr>
+          <w:rFonts w:ascii="Yu Gothic" w:cs="Yu Gothic" w:eastAsia="Yu Gothic" w:hAnsi="Yu Gothic"/>
+          <w:sz w:val="22"/>
+          <w:szCs w:val="22"/>
+        </w:rPr>
+        <w:t xml:space="preserve">4桁の暗証番号が10×10×10×10で1万通りあるのと同じ考え方で、建物がない場合も1通りと数えると、ちょうど1万通りです。全部をSEBEで計算できれば、南1棟と同じように補間でツールが作れるので、数学的には可能です。</w:t>
+      </w:r>
+    </w:p>
+    <w:p>
+      <w:pPr>
+        <w:spacing w:after="100" w:line="360"/>
+      </w:pPr>
+      <w:r>
+        <w:rPr>
+          <w:rFonts w:ascii="Yu Gothic" w:cs="Yu Gothic" w:eastAsia="Yu Gothic" w:hAnsi="Yu Gothic"/>
+          <w:sz w:val="22"/>
+          <w:szCs w:val="22"/>
+        </w:rPr>
+        <w:t xml:space="preserve">しかしSEBEは1回30秒〜1分かかるので、6,561回で約55〜109時間、1万回では約83〜167時間、休まず計算しても3.5〜7日かかります。</w:t>
       </w:r>
     </w:p>
     <w:p>
@@ -1045,7 +1045,7 @@
           <w:sz w:val="24"/>
           <w:szCs w:val="24"/>
         </w:rPr>
-        <w:t xml:space="preserve">分けて考える：各方向9通りだけ計算し、組み合わせは足し算で推定する</w:t>
+        <w:t xml:space="preserve">線形補間で4方向ツールを作る場合：入力から出力までの計算の流れ</w:t>
       </w:r>
     </w:p>
     <w:p>
@@ -1060,59 +1060,59 @@
           <w:sz w:val="18"/>
           <w:szCs w:val="18"/>
         </w:rPr>
-        <w:t xml:space="preserve">読み上げ目安：約1.5分（383字）</w:t>
-      </w:r>
-    </w:p>
-    <w:p>
-      <w:pPr>
-        <w:spacing w:after="100" w:line="360"/>
-      </w:pPr>
-      <w:r>
-        <w:rPr>
-          <w:rFonts w:ascii="Yu Gothic" w:cs="Yu Gothic" w:eastAsia="Yu Gothic" w:hAnsi="Yu Gothic"/>
-          <w:sz w:val="22"/>
-          <w:szCs w:val="22"/>
-        </w:rPr>
-        <w:t xml:space="preserve">そこで、先生のご指摘のとおり、1方向ずつ分けて考えます。手順は3つです。手順1では、SEBEで計算するのを「1棟だけ置いた配置」に限ります。各方向9通りを4方向分と、建物なしの1配置で、37配置です。左の南と東の表で言うと、埋まるのは端の行と列だけです。</w:t>
-      </w:r>
-    </w:p>
-    <w:p>
-      <w:pPr>
-        <w:spacing w:after="100" w:line="360"/>
-      </w:pPr>
-      <w:r>
-        <w:rPr>
-          <w:rFonts w:ascii="Yu Gothic" w:cs="Yu Gothic" w:eastAsia="Yu Gothic" w:hAnsi="Yu Gothic"/>
-          <w:sz w:val="22"/>
-          <w:szCs w:val="22"/>
-        </w:rPr>
-        <w:t xml:space="preserve">手順2では、2棟以上を置いた配置、つまり表の「?」のマスを足し算で推定します。例えば、建物なしで1000、南だけ置くと700なら、南の建物で減る量は300です。東だけ置くと900なら、東で減る量は100です。</w:t>
-      </w:r>
-    </w:p>
-    <w:p>
-      <w:pPr>
-        <w:spacing w:after="100" w:line="360"/>
-      </w:pPr>
-      <w:r>
-        <w:rPr>
-          <w:rFonts w:ascii="Yu Gothic" w:cs="Yu Gothic" w:eastAsia="Yu Gothic" w:hAnsi="Yu Gothic"/>
-          <w:sz w:val="22"/>
-          <w:szCs w:val="22"/>
-        </w:rPr>
-        <w:t xml:space="preserve">両方置いたときは、1000から300と100を引いて600と推定します。ただし、この足し算は、2棟が別々の光を遮ることを前提にしています。</w:t>
-      </w:r>
-    </w:p>
-    <w:p>
-      <w:pPr>
-        <w:spacing w:after="100" w:line="360"/>
-      </w:pPr>
-      <w:r>
-        <w:rPr>
-          <w:rFonts w:ascii="Yu Gothic" w:cs="Yu Gothic" w:eastAsia="Yu Gothic" w:hAnsi="Yu Gothic"/>
-          <w:sz w:val="22"/>
-          <w:szCs w:val="22"/>
-        </w:rPr>
-        <w:t xml:space="preserve">手順3では、この前提が成り立つか、つまり影の重なりでずれないかを、2〜4棟を同時に置いた配置をいくつかSEBEで計算して確かめます。ここでの数値は説明用の仮の値です。</w:t>
+        <w:t xml:space="preserve">読み上げ目安：約1.5分（404字）</w:t>
+      </w:r>
+    </w:p>
+    <w:p>
+      <w:pPr>
+        <w:spacing w:after="100" w:line="360"/>
+      </w:pPr>
+      <w:r>
+        <w:rPr>
+          <w:rFonts w:ascii="Yu Gothic" w:cs="Yu Gothic" w:eastAsia="Yu Gothic" w:hAnsi="Yu Gothic"/>
+          <w:sz w:val="22"/>
+          <w:szCs w:val="22"/>
+        </w:rPr>
+        <w:t xml:space="preserve">では、線形補間で4方向のツールを作る場合に、ツールの中でどんな計算をするのかを説明します。入力は12項目です。有無sは補間せず、どの表を使うかを決めるのに使います。有無の組み合わせは16通りあるので、組み合わせごとに別の表が必要です。</w:t>
+      </w:r>
+    </w:p>
+    <w:p>
+      <w:pPr>
+        <w:spacing w:after="100" w:line="360"/>
+      </w:pPr>
+      <w:r>
+        <w:rPr>
+          <w:rFonts w:ascii="Yu Gothic" w:cs="Yu Gothic" w:eastAsia="Yu Gothic" w:hAnsi="Yu Gothic"/>
+          <w:sz w:val="22"/>
+          <w:szCs w:val="22"/>
+        </w:rPr>
+        <w:t xml:space="preserve">高さAと隙間Dは連続した値なので補間し、4棟あれば8変数です。手順は、まず各変数について計算済みの下側の値Lと上側の値Uを探し、その間のどこにいるかを t＝(x−L)÷(U−L) で求めます。</w:t>
+      </w:r>
+    </w:p>
+    <w:p>
+      <w:pPr>
+        <w:spacing w:after="100" w:line="360"/>
+      </w:pPr>
+      <w:r>
+        <w:rPr>
+          <w:rFonts w:ascii="Yu Gothic" w:cs="Yu Gothic" w:eastAsia="Yu Gothic" w:hAnsi="Yu Gothic"/>
+          <w:sz w:val="22"/>
+          <w:szCs w:val="22"/>
+        </w:rPr>
+        <w:t xml:space="preserve">南1棟では2変数なので4隅を使いましたが、4棟では8変数なので、周りの頂点は2の8乗の256個になります。下の式のΣは256個の頂点の結果を全部足す記号、Πは8つの変数の割合を掛け合わせる記号です。</w:t>
+      </w:r>
+    </w:p>
+    <w:p>
+      <w:pPr>
+        <w:spacing w:after="100" w:line="360"/>
+      </w:pPr>
+      <w:r>
+        <w:rPr>
+          <w:rFonts w:ascii="Yu Gothic" w:cs="Yu Gothic" w:eastAsia="Yu Gothic" w:hAnsi="Yu Gothic"/>
+          <w:sz w:val="22"/>
+          <w:szCs w:val="22"/>
+        </w:rPr>
+        <w:t xml:space="preserve">つまり、各変数の位置から重みを計算して、周りの256配置の日射量を重み付き平均する方法で、これを20個の出力それぞれで行います。変数を2つにすると、22枚目の4隅の式と同じになります。</w:t>
       </w:r>
     </w:p>
     <w:p>
@@ -1141,7 +1141,7 @@
           <w:sz w:val="24"/>
           <w:szCs w:val="24"/>
         </w:rPr>
-        <w:t xml:space="preserve">ずれの原因＝影の重なり：2棟が同じ光を遮ると二重に引いてしまう</w:t>
+        <w:t xml:space="preserve">具体例：4方向すべて高さ35m・隙間15mで、256配置を平均する</w:t>
       </w:r>
     </w:p>
     <w:p>
@@ -1156,46 +1156,59 @@
           <w:sz w:val="18"/>
           <w:szCs w:val="18"/>
         </w:rPr>
-        <w:t xml:space="preserve">読み上げ目安：約1分（320字）</w:t>
-      </w:r>
-    </w:p>
-    <w:p>
-      <w:pPr>
-        <w:spacing w:after="100" w:line="360"/>
-      </w:pPr>
-      <w:r>
-        <w:rPr>
-          <w:rFonts w:ascii="Yu Gothic" w:cs="Yu Gothic" w:eastAsia="Yu Gothic" w:hAnsi="Yu Gothic"/>
-          <w:sz w:val="22"/>
-          <w:szCs w:val="22"/>
-        </w:rPr>
-        <w:t xml:space="preserve">手順3で確かめる「ずれ」の原因が、影の重なりです。南面の点Pでは、朝から昼前は東の建物が、昼前後は南の建物が光を遮るとします。東だけなら3時間、南だけなら5時間光が当たらないので、足し算では8時間になります。</w:t>
-      </w:r>
-    </w:p>
-    <w:p>
-      <w:pPr>
-        <w:spacing w:after="100" w:line="360"/>
-      </w:pPr>
-      <w:r>
-        <w:rPr>
-          <w:rFonts w:ascii="Yu Gothic" w:cs="Yu Gothic" w:eastAsia="Yu Gothic" w:hAnsi="Yu Gothic"/>
-          <w:sz w:val="22"/>
-          <w:szCs w:val="22"/>
-        </w:rPr>
-        <w:t xml:space="preserve">しかし9時から10時は、東と南が同じ光を遮っています。同じ光は1回しか遮れないので、実際に当たらないのは7時間です。日射量で見ると、足し算では600ですが、実際は640のようになり、足し算は低めにずれます。足し算の式には、この重なりは入っていません。</w:t>
-      </w:r>
-    </w:p>
-    <w:p>
-      <w:pPr>
-        <w:spacing w:after="100" w:line="360"/>
-      </w:pPr>
-      <w:r>
-        <w:rPr>
-          <w:rFonts w:ascii="Yu Gothic" w:cs="Yu Gothic" w:eastAsia="Yu Gothic" w:hAnsi="Yu Gothic"/>
-          <w:sz w:val="22"/>
-          <w:szCs w:val="22"/>
-        </w:rPr>
-        <w:t xml:space="preserve">そこで、重なりを含むSEBEの結果、つまり2〜4棟を同時に置いて計算した結果と比べて、ずれの大きさを確かめます。これが「影の重なりを考える」という意味です。数値は説明用の仮の値です。</w:t>
+        <w:t xml:space="preserve">読み上げ目安：約1.5分（449字）</w:t>
+      </w:r>
+    </w:p>
+    <w:p>
+      <w:pPr>
+        <w:spacing w:after="100" w:line="360"/>
+      </w:pPr>
+      <w:r>
+        <w:rPr>
+          <w:rFonts w:ascii="Yu Gothic" w:cs="Yu Gothic" w:eastAsia="Yu Gothic" w:hAnsi="Yu Gothic"/>
+          <w:sz w:val="22"/>
+          <w:szCs w:val="22"/>
+        </w:rPr>
+        <w:t xml:space="preserve">具体例です。4方向すべてに、高さ35m・隙間15mの建物があるとします。説明のため、各方向の格子を高さ25mと50m、隙間10mと25mとします。高さの位置は(35−25)÷(50−25)で0.4、隙間の位置は(15−10)÷(25−10)で3分の1です。</w:t>
+      </w:r>
+    </w:p>
+    <w:p>
+      <w:pPr>
+        <w:spacing w:after="100" w:line="360"/>
+      </w:pPr>
+      <w:r>
+        <w:rPr>
+          <w:rFonts w:ascii="Yu Gothic" w:cs="Yu Gothic" w:eastAsia="Yu Gothic" w:hAnsi="Yu Gothic"/>
+          <w:sz w:val="22"/>
+          <w:szCs w:val="22"/>
+        </w:rPr>
+        <w:t xml:space="preserve">1方向の4隅の重みは、例えば(25,10)は0.6×3分の2で0.4、(50,25)は0.4×3分の1で約0.133で、合計は1です。4方向それぞれがこの4通りを選ぶので、4×4×4×4＝256配置になります。</w:t>
+      </w:r>
+    </w:p>
+    <w:p>
+      <w:pPr>
+        <w:spacing w:after="100" w:line="360"/>
+      </w:pPr>
+      <w:r>
+        <w:rPr>
+          <w:rFonts w:ascii="Yu Gothic" w:cs="Yu Gothic" w:eastAsia="Yu Gothic" w:hAnsi="Yu Gothic"/>
+          <w:sz w:val="22"/>
+          <w:szCs w:val="22"/>
+        </w:rPr>
+        <w:t xml:space="preserve">右の図は256配置の重みで、濃い色ほど重みが大きい配置です。例えば、4方向すべてが(25,10)の配置の重みは0.4の4乗で0.0256です。その配置の南面0〜10m帯の保存値が仮に600なら、寄与は0.0256×600＝15.36です。</w:t>
+      </w:r>
+    </w:p>
+    <w:p>
+      <w:pPr>
+        <w:spacing w:after="100" w:line="360"/>
+      </w:pPr>
+      <w:r>
+        <w:rPr>
+          <w:rFonts w:ascii="Yu Gothic" w:cs="Yu Gothic" w:eastAsia="Yu Gothic" w:hAnsi="Yu Gothic"/>
+          <w:sz w:val="22"/>
+          <w:szCs w:val="22"/>
+        </w:rPr>
+        <w:t xml:space="preserve">残りの255配置も同じように重み×保存値を求めて全部足すと、予測値になります。保存値は4棟を同時に置いたSEBEの結果なので影の重なりも含まれますが、256個すべてが計算済みでないと使えません。</w:t>
       </w:r>
     </w:p>
     <w:p>
@@ -1224,7 +1237,7 @@
           <w:sz w:val="24"/>
           <w:szCs w:val="24"/>
         </w:rPr>
-        <w:t xml:space="preserve">足し算の方法を式で書く（Σは「番号を順に入れて全部足す」記号）</w:t>
+        <w:t xml:space="preserve">計算時間：1回30秒〜1分でも、全組み合わせは現実的でない</w:t>
       </w:r>
     </w:p>
     <w:p>
@@ -1239,72 +1252,59 @@
           <w:sz w:val="18"/>
           <w:szCs w:val="18"/>
         </w:rPr>
-        <w:t xml:space="preserve">読み上げ目安：約1.5分（453字）</w:t>
-      </w:r>
-    </w:p>
-    <w:p>
-      <w:pPr>
-        <w:spacing w:after="100" w:line="360"/>
-      </w:pPr>
-      <w:r>
-        <w:rPr>
-          <w:rFonts w:ascii="Yu Gothic" w:cs="Yu Gothic" w:eastAsia="Yu Gothic" w:hAnsi="Yu Gothic"/>
-          <w:sz w:val="22"/>
-          <w:szCs w:val="22"/>
-        </w:rPr>
-        <w:t xml:space="preserve">ここまでの方法を式で書くと、3つのステップになります。①は、方向iに1棟だけ置いたときに、面f・帯kの日射量が建物なしより減った量ΔYです。これはSEBEの結果どうしの引き算です。</w:t>
-      </w:r>
-    </w:p>
-    <w:p>
-      <w:pPr>
-        <w:spacing w:after="100" w:line="360"/>
-      </w:pPr>
-      <w:r>
-        <w:rPr>
-          <w:rFonts w:ascii="Yu Gothic" w:cs="Yu Gothic" w:eastAsia="Yu Gothic" w:hAnsi="Yu Gothic"/>
-          <w:sz w:val="22"/>
-          <w:szCs w:val="22"/>
-        </w:rPr>
-        <w:t xml:space="preserve">②は、入力のAとDが格子点でないときに、囲む4つの格子点の減る量を重みwで混ぜる式です。Σの下の「c＝1」と上の「4」は、4つの隅を1番から4番まで順に入れて足すという意味で、22枚目の補間と同じ計算です。</w:t>
-      </w:r>
-    </w:p>
-    <w:p>
-      <w:pPr>
-        <w:spacing w:after="100" w:line="360"/>
-      </w:pPr>
-      <w:r>
-        <w:rPr>
-          <w:rFonts w:ascii="Yu Gothic" w:cs="Yu Gothic" w:eastAsia="Yu Gothic" w:hAnsi="Yu Gothic"/>
-          <w:sz w:val="22"/>
-          <w:szCs w:val="22"/>
-        </w:rPr>
-        <w:t xml:space="preserve">③は、建物なしの値から、4方向の減る量にsを掛けて全部引く式です。Σの下の「i＝北、東、南、西」は、4つの方向を順に入れて足すという意味です。</w:t>
-      </w:r>
-    </w:p>
-    <w:p>
-      <w:pPr>
-        <w:spacing w:after="100" w:line="360"/>
-      </w:pPr>
-      <w:r>
-        <w:rPr>
-          <w:rFonts w:ascii="Yu Gothic" w:cs="Yu Gothic" w:eastAsia="Yu Gothic" w:hAnsi="Yu Gothic"/>
-          <w:sz w:val="22"/>
-          <w:szCs w:val="22"/>
-        </w:rPr>
-        <w:t xml:space="preserve">右下の例のように、東と南に建物がある場合、③のΣを展開すると北と西は0を掛けて消え、1000−100−300＝600になります。東の減る量は、例えば東の建物が高さ40m・隙間20mなら、4隅の重み0.133、0.200、0.267、0.400で混ぜて求めます。</w:t>
-      </w:r>
-    </w:p>
-    <w:p>
-      <w:pPr>
-        <w:spacing w:after="100" w:line="360"/>
-      </w:pPr>
-      <w:r>
-        <w:rPr>
-          <w:rFonts w:ascii="Yu Gothic" w:cs="Yu Gothic" w:eastAsia="Yu Gothic" w:hAnsi="Yu Gothic"/>
-          <w:sz w:val="22"/>
-          <w:szCs w:val="22"/>
-        </w:rPr>
-        <w:t xml:space="preserve">この計算を4面×5帯の20個それぞれで行います。なお、南だけを置いた場合は、③は今の南1棟ツールと同じ計算になります。</w:t>
+        <w:t xml:space="preserve">読み上げ目安：約1分（337字）</w:t>
+      </w:r>
+    </w:p>
+    <w:p>
+      <w:pPr>
+        <w:spacing w:after="100" w:line="360"/>
+      </w:pPr>
+      <w:r>
+        <w:rPr>
+          <w:rFonts w:ascii="Yu Gothic" w:cs="Yu Gothic" w:eastAsia="Yu Gothic" w:hAnsi="Yu Gothic"/>
+          <w:sz w:val="22"/>
+          <w:szCs w:val="22"/>
+        </w:rPr>
+        <w:t xml:space="preserve">では、全部の組み合わせをSEBEで計算する時間を見積もります。SEBEは1回30秒〜1分かかります。南1棟の9配置なら5〜9分です。</w:t>
+      </w:r>
+    </w:p>
+    <w:p>
+      <w:pPr>
+        <w:spacing w:after="100" w:line="360"/>
+      </w:pPr>
+      <w:r>
+        <w:rPr>
+          <w:rFonts w:ascii="Yu Gothic" w:cs="Yu Gothic" w:eastAsia="Yu Gothic" w:hAnsi="Yu Gothic"/>
+          <w:sz w:val="22"/>
+          <w:szCs w:val="22"/>
+        </w:rPr>
+        <w:t xml:space="preserve">4棟ありの6,561配置では約55〜109時間、建物なしも含めた1万配置では約83〜167時間、格子を4段階に細かくした83,521配置では約29〜58日かかります。</w:t>
+      </w:r>
+    </w:p>
+    <w:p>
+      <w:pPr>
+        <w:spacing w:after="100" w:line="360"/>
+      </w:pPr>
+      <w:r>
+        <w:rPr>
+          <w:rFonts w:ascii="Yu Gothic" w:cs="Yu Gothic" w:eastAsia="Yu Gothic" w:hAnsi="Yu Gothic"/>
+          <w:sz w:val="22"/>
+          <w:szCs w:val="22"/>
+        </w:rPr>
+        <w:t xml:space="preserve">さらに最終目標の17変数では、各建物が「なし＋高さ3×距離3×方位3」の28通り、それが4棟分で、中央の高さが4通りなので、約246万配置になり、約2.3〜4.7年かかります。</w:t>
+      </w:r>
+    </w:p>
+    <w:p>
+      <w:pPr>
+        <w:spacing w:after="100" w:line="360"/>
+      </w:pPr>
+      <w:r>
+        <w:rPr>
+          <w:rFonts w:ascii="Yu Gothic" w:cs="Yu Gothic" w:eastAsia="Yu Gothic" w:hAnsi="Yu Gothic"/>
+          <w:sz w:val="22"/>
+          <w:szCs w:val="22"/>
+        </w:rPr>
+        <w:t xml:space="preserve">しかもこれは連続で計算した時間だけで、入力の作成や保存、失敗したときの再計算、検証用の配置は含んでいません。格子がそろえば補間の計算自体は簡単ですが、問題は格子をそろえるための計算時間とデータ量です。</w:t>
       </w:r>
     </w:p>
     <w:p>
@@ -1333,7 +1333,7 @@
           <w:sz w:val="24"/>
           <w:szCs w:val="24"/>
         </w:rPr>
-        <w:t xml:space="preserve">来週の確認：SEBEで計算し、足し算の誤差を数値で示す</w:t>
+        <w:t xml:space="preserve">4方向で6,561通り → 17変数では別の学習方法が必要</w:t>
       </w:r>
     </w:p>
     <w:p>
@@ -1348,59 +1348,59 @@
           <w:sz w:val="18"/>
           <w:szCs w:val="18"/>
         </w:rPr>
-        <w:t xml:space="preserve">読み上げ目安：約1.5分（386字）</w:t>
-      </w:r>
-    </w:p>
-    <w:p>
-      <w:pPr>
-        <w:spacing w:after="100" w:line="360"/>
-      </w:pPr>
-      <w:r>
-        <w:rPr>
-          <w:rFonts w:ascii="Yu Gothic" w:cs="Yu Gothic" w:eastAsia="Yu Gothic" w:hAnsi="Yu Gothic"/>
-          <w:sz w:val="22"/>
-          <w:szCs w:val="22"/>
-        </w:rPr>
-        <w:t xml:space="preserve">来週の計画です。手順1の学習用データは、1棟だけ置いた配置です。第一候補の案Aは、各方向を南と同じ4×4の16通りにする案で、合計65配置、そのうち新しく計算するのは49配置です。南の広範囲版と同じ細かさで、テストで誤差率2.42%を確認しています。</w:t>
-      </w:r>
-    </w:p>
-    <w:p>
-      <w:pPr>
-        <w:spacing w:after="100" w:line="360"/>
-      </w:pPr>
-      <w:r>
-        <w:rPr>
-          <w:rFonts w:ascii="Yu Gothic" w:cs="Yu Gothic" w:eastAsia="Yu Gothic" w:hAnsi="Yu Gothic"/>
-          <w:sz w:val="22"/>
-          <w:szCs w:val="22"/>
-        </w:rPr>
-        <w:t xml:space="preserve">時間が足りない場合は、各方向を3×3の9通りにする案Bで、合計37配置、新規28配置です。手順3の確認用データは2種類です。テストAは1棟だけの6配置で、補間そのものの誤差を見ます。</w:t>
-      </w:r>
-    </w:p>
-    <w:p>
-      <w:pPr>
-        <w:spacing w:after="100" w:line="360"/>
-      </w:pPr>
-      <w:r>
-        <w:rPr>
-          <w:rFonts w:ascii="Yu Gothic" w:cs="Yu Gothic" w:eastAsia="Yu Gothic" w:hAnsi="Yu Gothic"/>
-          <w:sz w:val="22"/>
-          <w:szCs w:val="22"/>
-        </w:rPr>
-        <w:t xml:space="preserve">テストBは2〜4棟を同時に置いた12配置で、足し算の誤差、つまり影の重なりの影響を見ます。左下の表を来週埋めます。棟数が増えても誤差がほぼ変わらなければ、4方向版は「分けて計算＋足し算」で作ります。</w:t>
-      </w:r>
-    </w:p>
-    <w:p>
-      <w:pPr>
-        <w:spacing w:after="100" w:line="360"/>
-      </w:pPr>
-      <w:r>
-        <w:rPr>
-          <w:rFonts w:ascii="Yu Gothic" w:cs="Yu Gothic" w:eastAsia="Yu Gothic" w:hAnsi="Yu Gothic"/>
-          <w:sz w:val="22"/>
-          <w:szCs w:val="22"/>
-        </w:rPr>
-        <w:t xml:space="preserve">棟数とともに誤差が大きくなれば、重なりの補正を加えるか、次に説明する代案に進みます。判断の基準は、結果を見る前に先生と決めたいと考えています。</w:t>
+        <w:t xml:space="preserve">読み上げ目安：約1.5分（380字）</w:t>
+      </w:r>
+    </w:p>
+    <w:p>
+      <w:pPr>
+        <w:spacing w:after="100" w:line="360"/>
+      </w:pPr>
+      <w:r>
+        <w:rPr>
+          <w:rFonts w:ascii="Yu Gothic" w:cs="Yu Gothic" w:eastAsia="Yu Gothic" w:hAnsi="Yu Gothic"/>
+          <w:sz w:val="22"/>
+          <w:szCs w:val="22"/>
+        </w:rPr>
+        <w:t xml:space="preserve">以上をまとめると、南1棟では補間する変数が2個で9配置、数分で表が作れました。4方向版では8個になり、1万配置、1回の予測で256頂点、計算に3.5〜7日かかります。</w:t>
+      </w:r>
+    </w:p>
+    <w:p>
+      <w:pPr>
+        <w:spacing w:after="100" w:line="360"/>
+      </w:pPr>
+      <w:r>
+        <w:rPr>
+          <w:rFonts w:ascii="Yu Gothic" w:cs="Yu Gothic" w:eastAsia="Yu Gothic" w:hAnsi="Yu Gothic"/>
+          <w:sz w:val="22"/>
+          <w:szCs w:val="22"/>
+        </w:rPr>
+        <w:t xml:space="preserve">最終目標の17変数では、連続して変わる変数が13個になり、約246万配置、1回の予測で8,192頂点、計算に数年かかります。4方向だけで6,561通りになってしまうので、17変数を考えると、線形補間で全部の組み合わせを表にする方式は成立しません。</w:t>
+      </w:r>
+    </w:p>
+    <w:p>
+      <w:pPr>
+        <w:spacing w:after="100" w:line="360"/>
+      </w:pPr>
+      <w:r>
+        <w:rPr>
+          <w:rFonts w:ascii="Yu Gothic" w:cs="Yu Gothic" w:eastAsia="Yu Gothic" w:hAnsi="Yu Gothic"/>
+          <w:sz w:val="22"/>
+          <w:szCs w:val="22"/>
+        </w:rPr>
+        <w:t xml:space="preserve">そこで、別の学習方法として「空の遮られ方」を考えます。これは、建物の配置をそのまま使わず、壁の点から見てどの方向の空がふさがれているかという「空の地図」に変えてから、機械学習で日射量を予測する方法です。</w:t>
+      </w:r>
+    </w:p>
+    <w:p>
+      <w:pPr>
+        <w:spacing w:after="100" w:line="360"/>
+      </w:pPr>
+      <w:r>
+        <w:rPr>
+          <w:rFonts w:ascii="Yu Gothic" w:cs="Yu Gothic" w:eastAsia="Yu Gothic" w:hAnsi="Yu Gothic"/>
+          <w:sz w:val="22"/>
+          <w:szCs w:val="22"/>
+        </w:rPr>
+        <w:t xml:space="preserve">どんな配置でも同じ大きさの地図になるので、格子をそろえる必要がありません。ただし、必要な配置の数や精度はまだ分からないので、来週詳しく検討します。</w:t>
       </w:r>
     </w:p>
     <w:p>
@@ -1444,20 +1444,20 @@
           <w:sz w:val="18"/>
           <w:szCs w:val="18"/>
         </w:rPr>
-        <w:t xml:space="preserve">読み上げ目安：約1分（292字）</w:t>
-      </w:r>
-    </w:p>
-    <w:p>
-      <w:pPr>
-        <w:spacing w:after="100" w:line="360"/>
-      </w:pPr>
-      <w:r>
-        <w:rPr>
-          <w:rFonts w:ascii="Yu Gothic" w:cs="Yu Gothic" w:eastAsia="Yu Gothic" w:hAnsi="Yu Gothic"/>
-          <w:sz w:val="22"/>
-          <w:szCs w:val="22"/>
-        </w:rPr>
-        <w:t xml:space="preserve">足し算でうまくいかなかった場合の代案が、「空の遮られ方」を使う方法です。壁の点から空を見上げて、どの方向の空が建物でふさがれているかを数えます。</w:t>
+        <w:t xml:space="preserve">読み上げ目安：約1分（321字）</w:t>
+      </w:r>
+    </w:p>
+    <w:p>
+      <w:pPr>
+        <w:spacing w:after="100" w:line="360"/>
+      </w:pPr>
+      <w:r>
+        <w:rPr>
+          <w:rFonts w:ascii="Yu Gothic" w:cs="Yu Gothic" w:eastAsia="Yu Gothic" w:hAnsi="Yu Gothic"/>
+          <w:sz w:val="22"/>
+          <w:szCs w:val="22"/>
+        </w:rPr>
+        <w:t xml:space="preserve">その別の方法が「空の遮られ方」を使う方法です。壁の点から空を見上げて、どの方向の空が建物でふさがれているかを数えます。</w:t>
       </w:r>
     </w:p>
     <w:p>
@@ -1496,7 +1496,7 @@
           <w:sz w:val="22"/>
           <w:szCs w:val="22"/>
         </w:rPr>
-        <w:t xml:space="preserve">同じマスは1回しか数えないので、足し算のような二重引きが起きません。低い建物の値は説明用です。</w:t>
+        <w:t xml:space="preserve">同じマスは1回しか数えないので、2棟が同じ方向をふさいでも二重には数えません。また、棟数や方位が変わっても、いつも同じ72マスの地図になるのが特徴です。低い建物の値は説明用です。</w:t>
       </w:r>
     </w:p>
     <w:p>
@@ -1525,7 +1525,7 @@
           <w:sz w:val="24"/>
           <w:szCs w:val="24"/>
         </w:rPr>
-        <w:t xml:space="preserve">空の遮られ方：計算の流れと、足し算の方法との違い</w:t>
+        <w:t xml:space="preserve">空の遮られ方：計算の流れと、線形補間との違い</w:t>
       </w:r>
     </w:p>
     <w:p>
@@ -1540,46 +1540,59 @@
           <w:sz w:val="18"/>
           <w:szCs w:val="18"/>
         </w:rPr>
-        <w:t xml:space="preserve">読み上げ目安：約1分（317字）</w:t>
-      </w:r>
-    </w:p>
-    <w:p>
-      <w:pPr>
-        <w:spacing w:after="100" w:line="360"/>
-      </w:pPr>
-      <w:r>
-        <w:rPr>
-          <w:rFonts w:ascii="Yu Gothic" w:cs="Yu Gothic" w:eastAsia="Yu Gothic" w:hAnsi="Yu Gothic"/>
-          <w:sz w:val="22"/>
-          <w:szCs w:val="22"/>
-        </w:rPr>
-        <w:t xml:space="preserve">空の遮られ方の計算の流れです。入力、学習、テストのデータは、足し算の方法と同じものを使えます。違うのは、配置をそのまま使わず、方向ごとの遮蔽高度角hや、ふさがれた割合Oという数値に変えてから、機械学習のモデルFで日射量を予測する点です。</w:t>
-      </w:r>
-    </w:p>
-    <w:p>
-      <w:pPr>
-        <w:spacing w:after="100" w:line="360"/>
-      </w:pPr>
-      <w:r>
-        <w:rPr>
-          <w:rFonts w:ascii="Yu Gothic" w:cs="Yu Gothic" w:eastAsia="Yu Gothic" w:hAnsi="Yu Gothic"/>
-          <w:sz w:val="22"/>
-          <w:szCs w:val="22"/>
-        </w:rPr>
-        <w:t xml:space="preserve">hの式の「max」は、有る建物の中で一番高く見える角度を選ぶという意味で、2棟が同じ方向をふさいでも1回だけ数えることになります。Oの式の「Σ」は、J個のマスの0と1を全部足すという意味で、ふさがれたマスの数を数えています。</w:t>
-      </w:r>
-    </w:p>
-    <w:p>
-      <w:pPr>
-        <w:spacing w:after="100" w:line="360"/>
-      </w:pPr>
-      <w:r>
-        <w:rPr>
-          <w:rFonts w:ascii="Yu Gothic" w:cs="Yu Gothic" w:eastAsia="Yu Gothic" w:hAnsi="Yu Gothic"/>
-          <w:sz w:val="22"/>
-          <w:szCs w:val="22"/>
-        </w:rPr>
-        <w:t xml:space="preserve">方向の分け方、距離の正確な求め方、モデルの種類はまだ決まっていないので、来週詰めます。また、この方法が線形補間より必ず良いとは言えないので、同じテスト配置で比べて判断します。</w:t>
+        <w:t xml:space="preserve">読み上げ目安：約1分（369字）</w:t>
+      </w:r>
+    </w:p>
+    <w:p>
+      <w:pPr>
+        <w:spacing w:after="100" w:line="360"/>
+      </w:pPr>
+      <w:r>
+        <w:rPr>
+          <w:rFonts w:ascii="Yu Gothic" w:cs="Yu Gothic" w:eastAsia="Yu Gothic" w:hAnsi="Yu Gothic"/>
+          <w:sz w:val="22"/>
+          <w:szCs w:val="22"/>
+        </w:rPr>
+        <w:t xml:space="preserve">空の遮られ方の計算の流れです。入力は配置の変数で、線形補間と同じです。違うのは、配置をそのまま表にするのではなく、方向ごとの遮蔽高度角hや、ふさがれた割合Oという数値に変えてから、機械学習のモデルFで日射量を予測する点です。</w:t>
+      </w:r>
+    </w:p>
+    <w:p>
+      <w:pPr>
+        <w:spacing w:after="100" w:line="360"/>
+      </w:pPr>
+      <w:r>
+        <w:rPr>
+          <w:rFonts w:ascii="Yu Gothic" w:cs="Yu Gothic" w:eastAsia="Yu Gothic" w:hAnsi="Yu Gothic"/>
+          <w:sz w:val="22"/>
+          <w:szCs w:val="22"/>
+        </w:rPr>
+        <w:t xml:space="preserve">hの式のmaxは、有る建物の中で一番高く見える角度を選ぶという意味、Oの式のΣは、J個のマスの0と1を全部足して、ふさがれたマスの数を数えるという意味です。</w:t>
+      </w:r>
+    </w:p>
+    <w:p>
+      <w:pPr>
+        <w:spacing w:after="100" w:line="360"/>
+      </w:pPr>
+      <w:r>
+        <w:rPr>
+          <w:rFonts w:ascii="Yu Gothic" w:cs="Yu Gothic" w:eastAsia="Yu Gothic" w:hAnsi="Yu Gothic"/>
+          <w:sz w:val="22"/>
+          <w:szCs w:val="22"/>
+        </w:rPr>
+        <w:t xml:space="preserve">右の表のように、線形補間は格子の全配置、4方向で1万配置が必要で、変数が増えると3倍ずつ増えますが、この方法は格子をそろえる必要がなく、変数が増えても入力の大きさは変わりません。</w:t>
+      </w:r>
+    </w:p>
+    <w:p>
+      <w:pPr>
+        <w:spacing w:after="100" w:line="360"/>
+      </w:pPr>
+      <w:r>
+        <w:rPr>
+          <w:rFonts w:ascii="Yu Gothic" w:cs="Yu Gothic" w:eastAsia="Yu Gothic" w:hAnsi="Yu Gothic"/>
+          <w:sz w:val="22"/>
+          <w:szCs w:val="22"/>
+        </w:rPr>
+        <w:t xml:space="preserve">方向の分け方、距離の正確な求め方、モデルの種類、必要な配置の数はまだ決まっていないので、来週詰めます。また、線形補間より必ず良いとは言えないので、同じテスト配置で比べて判断します。</w:t>
       </w:r>
     </w:p>
     <w:p>
@@ -1623,46 +1636,46 @@
           <w:sz w:val="18"/>
           <w:szCs w:val="18"/>
         </w:rPr>
-        <w:t xml:space="preserve">読み上げ目安：約1分（261字）</w:t>
-      </w:r>
-    </w:p>
-    <w:p>
-      <w:pPr>
-        <w:spacing w:after="100" w:line="360"/>
-      </w:pPr>
-      <w:r>
-        <w:rPr>
-          <w:rFonts w:ascii="Yu Gothic" w:cs="Yu Gothic" w:eastAsia="Yu Gothic" w:hAnsi="Yu Gothic"/>
-          <w:sz w:val="22"/>
-          <w:szCs w:val="22"/>
-        </w:rPr>
-        <w:t xml:space="preserve">まとめです。今回は、データの役割と計算の過程、最終ツールの変数と、有無を0と1で表す理由を整理しました。また、4方向を全部計算すると6,561通り、建物なしも含めると1万通りになるため、各方向を分けて計算し、組み合わせは足し算で推定する方法を考えました。</w:t>
-      </w:r>
-    </w:p>
-    <w:p>
-      <w:pPr>
-        <w:spacing w:after="100" w:line="360"/>
-      </w:pPr>
-      <w:r>
-        <w:rPr>
-          <w:rFonts w:ascii="Yu Gothic" w:cs="Yu Gothic" w:eastAsia="Yu Gothic" w:hAnsi="Yu Gothic"/>
-          <w:sz w:val="22"/>
-          <w:szCs w:val="22"/>
-        </w:rPr>
-        <w:t xml:space="preserve">足し算は影の重なりを含まないので、そのずれを確かめる必要があります。来週は、1棟だけの配置をSEBEで計算し、2〜4棟を同時に置いた配置と比べて、棟数ごとの誤差を数値で示します。その結果を見て、足し算の方法を続けるか、代案に進むかを判断したいと考えています。</w:t>
-      </w:r>
-    </w:p>
-    <w:p>
-      <w:pPr>
-        <w:spacing w:after="100" w:line="360"/>
-      </w:pPr>
-      <w:r>
-        <w:rPr>
-          <w:rFonts w:ascii="Yu Gothic" w:cs="Yu Gothic" w:eastAsia="Yu Gothic" w:hAnsi="Yu Gothic"/>
-          <w:sz w:val="22"/>
-          <w:szCs w:val="22"/>
-        </w:rPr>
-        <w:t xml:space="preserve">以上です。</w:t>
+        <w:t xml:space="preserve">読み上げ目安：約1分（284字）</w:t>
+      </w:r>
+    </w:p>
+    <w:p>
+      <w:pPr>
+        <w:spacing w:after="100" w:line="360"/>
+      </w:pPr>
+      <w:r>
+        <w:rPr>
+          <w:rFonts w:ascii="Yu Gothic" w:cs="Yu Gothic" w:eastAsia="Yu Gothic" w:hAnsi="Yu Gothic"/>
+          <w:sz w:val="22"/>
+          <w:szCs w:val="22"/>
+        </w:rPr>
+        <w:t xml:space="preserve">まとめです。今回は、データの役割と計算の過程、最終ツールの変数と、有無を0と1で表す理由を整理しました。また、線形補間で4方向のツールを作る場合の計算を具体的に示しました。</w:t>
+      </w:r>
+    </w:p>
+    <w:p>
+      <w:pPr>
+        <w:spacing w:after="100" w:line="360"/>
+      </w:pPr>
+      <w:r>
+        <w:rPr>
+          <w:rFonts w:ascii="Yu Gothic" w:cs="Yu Gothic" w:eastAsia="Yu Gothic" w:hAnsi="Yu Gothic"/>
+          <w:sz w:val="22"/>
+          <w:szCs w:val="22"/>
+        </w:rPr>
+        <w:t xml:space="preserve">4方向だけでも6,561〜1万配置、1回の予測で256頂点が必要で、SEBEが1回30秒〜1分でも3.5〜7日かかります。17変数では約246万配置、数年かかるので、線形補間で全組み合わせを表にする方式は成立しません。</w:t>
+      </w:r>
+    </w:p>
+    <w:p>
+      <w:pPr>
+        <w:spacing w:after="100" w:line="360"/>
+      </w:pPr>
+      <w:r>
+        <w:rPr>
+          <w:rFonts w:ascii="Yu Gothic" w:cs="Yu Gothic" w:eastAsia="Yu Gothic" w:hAnsi="Yu Gothic"/>
+          <w:sz w:val="22"/>
+          <w:szCs w:val="22"/>
+        </w:rPr>
+        <w:t xml:space="preserve">来週は、代わりの方法である空の遮られ方について、計算方法や学習に使う配置の数、モデルを詰めます。まずは南1棟の既存データで試し、線形補間と精度を比べたいと考えています。以上です。</w:t>
       </w:r>
     </w:p>
     <w:p>
@@ -1741,7 +1754,7 @@
           <w:sz w:val="22"/>
           <w:szCs w:val="22"/>
         </w:rPr>
-        <w:t xml:space="preserve">Q2．6,561通りを全部計算しないのはなぜですか？</w:t>
+        <w:t xml:space="preserve">Q2．線形補間は4方向では使えないのですか？</w:t>
       </w:r>
     </w:p>
     <w:p>
@@ -1754,7 +1767,7 @@
           <w:sz w:val="22"/>
           <w:szCs w:val="22"/>
         </w:rPr>
-        <w:t xml:space="preserve">A．全部計算できれば南1棟と同じ方法で補間でき、一番確実です。ただ、南1棟の研究全体（47配置）の約140倍の計算が必要で、現実的ではないためです。</w:t>
+        <w:t xml:space="preserve">A．数学的には使えます。ただし全部の組み合わせを事前にSEBEで計算しておく必要があり、1回30秒〜1分でも4方向で約3.5〜7日、17変数では約2.3〜4.7年かかるため、ツールを作る方式としては成立しません。</w:t>
       </w:r>
     </w:p>
     <w:p>
@@ -1768,7 +1781,7 @@
           <w:sz w:val="18"/>
           <w:szCs w:val="18"/>
         </w:rPr>
-        <w:t xml:space="preserve">関連スライド：29枚目</w:t>
+        <w:t xml:space="preserve">関連スライド：29・32・33枚目</w:t>
       </w:r>
     </w:p>
     <w:p>
@@ -1785,7 +1798,7 @@
           <w:sz w:val="22"/>
           <w:szCs w:val="22"/>
         </w:rPr>
-        <w:t xml:space="preserve">Q3．各方向9通り（または16通り）の計算だけで、組み合わせを予測できるのですか？</w:t>
+        <w:t xml:space="preserve">Q3．256個の頂点とは何ですか？</w:t>
       </w:r>
     </w:p>
     <w:p>
@@ -1798,7 +1811,7 @@
           <w:sz w:val="22"/>
           <w:szCs w:val="22"/>
         </w:rPr>
-        <w:t xml:space="preserve">A．1棟だけの配置は補間で予測できます。組み合わせは「建物なしの値 − 各建物で減る量」の足し算で推定します。これが正しいのは2棟が別々の光を遮る場合なので、2〜4棟を同時に置いた配置でSEBEと比べて確かめます。</w:t>
+        <w:t xml:space="preserve">A．補間する8つの変数それぞれに「下側・上側」の2通りがあるので、2⁸＝256個の組み合わせ（頂点）になります。南1棟は2変数なので 2²＝4隅でした。</w:t>
       </w:r>
     </w:p>
     <w:p>
@@ -1812,7 +1825,7 @@
           <w:sz w:val="18"/>
           <w:szCs w:val="18"/>
         </w:rPr>
-        <w:t xml:space="preserve">関連スライド：30・33枚目</w:t>
+        <w:t xml:space="preserve">関連スライド：30・31枚目</w:t>
       </w:r>
     </w:p>
     <w:p>
@@ -1829,7 +1842,7 @@
           <w:sz w:val="22"/>
           <w:szCs w:val="22"/>
         </w:rPr>
-        <w:t xml:space="preserve">Q4．影の重なりはどうやって考慮するのですか？</w:t>
+        <w:t xml:space="preserve">Q4．Σ と Π はどういう意味ですか？</w:t>
       </w:r>
     </w:p>
     <w:p>
@@ -1842,7 +1855,7 @@
           <w:sz w:val="22"/>
           <w:szCs w:val="22"/>
         </w:rPr>
-        <w:t xml:space="preserve">A．足し算の式そのものには入っていません。重なりを含むSEBEの結果（2〜4棟を同時に計算）と比べ、ずれの大きさを棟数ごとに測ります。ずれが大きければ、重なりの補正を加えるか、代案の「空の遮られ方」に進みます。</w:t>
+        <w:t xml:space="preserve">A．Σは「番号を順に入れて全部足す」、Πは「番号を順に入れて全部掛ける」記号です。30枚目の式では、8変数の割合を掛けて（Π）各頂点の重みを出し、256頂点の「重み×保存値」を全部足して（Σ）予測値にしています。</w:t>
       </w:r>
     </w:p>
     <w:p>
@@ -1856,7 +1869,7 @@
           <w:sz w:val="18"/>
           <w:szCs w:val="18"/>
         </w:rPr>
-        <w:t xml:space="preserve">関連スライド：31・33枚目</w:t>
+        <w:t xml:space="preserve">関連スライド：22・30枚目</w:t>
       </w:r>
     </w:p>
     <w:p>
@@ -1873,7 +1886,7 @@
           <w:sz w:val="22"/>
           <w:szCs w:val="22"/>
         </w:rPr>
-        <w:t xml:space="preserve">Q5．Σはどういう意味ですか？</w:t>
+        <w:t xml:space="preserve">Q5．各方向を別々に計算して、結果を足せばよいのでは？</w:t>
       </w:r>
     </w:p>
     <w:p>
@@ -1886,7 +1899,7 @@
           <w:sz w:val="22"/>
           <w:szCs w:val="22"/>
         </w:rPr>
-        <w:t xml:space="preserve">A．Σの下に書いた番号から上に書いた番号まで、順に入れて全部足すという記号です。例えば Σ(c＝1〜4) w_c × y_k(c) は、w₁×y(1)＋w₂×y(2)＋w₃×y(3)＋w₄×y(4) のことです。</w:t>
+        <w:t xml:space="preserve">A．計算量は減りますが、2棟が同じ光を遮る（影の重なり）場合にずれます。さらに方位や中央の高さが変わると同じ問題が残るため、重なりを1回だけ数えられる「空の遮られ方」の方が、17変数への広げ方として見通しがよいと考えています。</w:t>
       </w:r>
     </w:p>
     <w:p>
@@ -1900,7 +1913,7 @@
           <w:sz w:val="18"/>
           <w:szCs w:val="18"/>
         </w:rPr>
-        <w:t xml:space="preserve">関連スライド：22・32枚目</w:t>
+        <w:t xml:space="preserve">関連スライド：33・34枚目</w:t>
       </w:r>
     </w:p>
     <w:p>
@@ -1917,7 +1930,7 @@
           <w:sz w:val="22"/>
           <w:szCs w:val="22"/>
         </w:rPr>
-        <w:t xml:space="preserve">Q6．重み w₁〜w₄ は何ですか？</w:t>
+        <w:t xml:space="preserve">Q6．SEBEの計算時間はどれくらいですか？</w:t>
       </w:r>
     </w:p>
     <w:p>
@@ -1930,7 +1943,7 @@
           <w:sz w:val="22"/>
           <w:szCs w:val="22"/>
         </w:rPr>
-        <w:t xml:space="preserve">A．入力を囲む4隅の値を、それぞれ何割使うかを表す割合です。高さ方向の割合と距離方向の割合の掛け算で求め、入力に近い隅ほど大きく、合計は必ず1になります。</w:t>
+        <w:t xml:space="preserve">A．1配置あたり30秒〜1分です。この値をもとに、32枚目の計算時間を見積もりました。入力作成・保存・再計算・検証用の配置は含んでいません。</w:t>
       </w:r>
     </w:p>
     <w:p>
@@ -1944,7 +1957,7 @@
           <w:sz w:val="18"/>
           <w:szCs w:val="18"/>
         </w:rPr>
-        <w:t xml:space="preserve">関連スライド：22枚目</w:t>
+        <w:t xml:space="preserve">関連スライド：32枚目</w:t>
       </w:r>
     </w:p>
     <w:p>
@@ -1961,7 +1974,7 @@
           <w:sz w:val="22"/>
           <w:szCs w:val="22"/>
         </w:rPr>
-        <w:t xml:space="preserve">Q7．建物がないときは A＝0 とすればよいのでは？</w:t>
+        <w:t xml:space="preserve">Q7．空の遮られ方なら、何配置あればよいのですか？</w:t>
       </w:r>
     </w:p>
     <w:p>
@@ -1974,7 +1987,7 @@
           <w:sz w:val="22"/>
           <w:szCs w:val="22"/>
         </w:rPr>
-        <w:t xml:space="preserve">A．計算済みの表は A 25〜100m なので、A＝0 は表の外になり、囲む4点がなく補間できません。そのため、有無を表す変数 s を使います。</w:t>
+        <w:t xml:space="preserve">A．まだ分かりません。格子をそろえる必要はありませんが、学習に必要な配置の数と選び方は来週検討します。</w:t>
       </w:r>
     </w:p>
     <w:p>
@@ -1988,7 +2001,7 @@
           <w:sz w:val="18"/>
           <w:szCs w:val="18"/>
         </w:rPr>
-        <w:t xml:space="preserve">関連スライド：27枚目</w:t>
+        <w:t xml:space="preserve">関連スライド：33・35枚目</w:t>
       </w:r>
     </w:p>
     <w:p>
@@ -2005,7 +2018,7 @@
           <w:sz w:val="22"/>
           <w:szCs w:val="22"/>
         </w:rPr>
-        <w:t xml:space="preserve">Q8．案Aと案Bのどちらにしますか？</w:t>
+        <w:t xml:space="preserve">Q8．建物がないときは A＝0 とすればよいのでは？</w:t>
       </w:r>
     </w:p>
     <w:p>
@@ -2018,7 +2031,7 @@
           <w:sz w:val="22"/>
           <w:szCs w:val="22"/>
         </w:rPr>
-        <w:t xml:space="preserve">A．南の広範囲版と同じ細かさで、精度を確認済みの案A（65配置）を第一候補にしています。SEBEの計算時間が足りない場合は案B（37配置）にします。</w:t>
+        <w:t xml:space="preserve">A．計算済みの表は A 25〜100m なので、A＝0 は表の外になり、囲む4点がなく補間できません。そのため、有無を表す変数 s を使います。</w:t>
       </w:r>
     </w:p>
     <w:p>
@@ -2032,7 +2045,7 @@
           <w:sz w:val="18"/>
           <w:szCs w:val="18"/>
         </w:rPr>
-        <w:t xml:space="preserve">関連スライド：33枚目</w:t>
+        <w:t xml:space="preserve">関連スライド：27枚目</w:t>
       </w:r>
     </w:p>
     <w:p>

</xml_diff>

<commit_message>
Redesign slide 30: show interpolation growing from 1 to 8 variables with color-coded formula
Co-Authored-By: Claude Opus 5.5 <noreply@anthropic.com>
Claude-Session: https://claude.ai/code/session_016RiyjW2dcXEqTbVbvy54mh
</commit_message>
<xml_diff>
--- a/slides/発表原稿_19-36枚目.docx
+++ b/slides/発表原稿_19-36枚目.docx
@@ -1045,7 +1045,7 @@
           <w:sz w:val="24"/>
           <w:szCs w:val="24"/>
         </w:rPr>
-        <w:t xml:space="preserve">線形補間で4方向ツールを作る場合：入力から出力までの計算の流れ</w:t>
+        <w:t xml:space="preserve">線形補間の考え方は同じ：変数が増えると「使う点」が2倍ずつ増える</w:t>
       </w:r>
     </w:p>
     <w:p>
@@ -1060,59 +1060,59 @@
           <w:sz w:val="18"/>
           <w:szCs w:val="18"/>
         </w:rPr>
-        <w:t xml:space="preserve">読み上げ目安：約1.5分（404字）</w:t>
-      </w:r>
-    </w:p>
-    <w:p>
-      <w:pPr>
-        <w:spacing w:after="100" w:line="360"/>
-      </w:pPr>
-      <w:r>
-        <w:rPr>
-          <w:rFonts w:ascii="Yu Gothic" w:cs="Yu Gothic" w:eastAsia="Yu Gothic" w:hAnsi="Yu Gothic"/>
-          <w:sz w:val="22"/>
-          <w:szCs w:val="22"/>
-        </w:rPr>
-        <w:t xml:space="preserve">では、線形補間で4方向のツールを作る場合に、ツールの中でどんな計算をするのかを説明します。入力は12項目です。有無sは補間せず、どの表を使うかを決めるのに使います。有無の組み合わせは16通りあるので、組み合わせごとに別の表が必要です。</w:t>
-      </w:r>
-    </w:p>
-    <w:p>
-      <w:pPr>
-        <w:spacing w:after="100" w:line="360"/>
-      </w:pPr>
-      <w:r>
-        <w:rPr>
-          <w:rFonts w:ascii="Yu Gothic" w:cs="Yu Gothic" w:eastAsia="Yu Gothic" w:hAnsi="Yu Gothic"/>
-          <w:sz w:val="22"/>
-          <w:szCs w:val="22"/>
-        </w:rPr>
-        <w:t xml:space="preserve">高さAと隙間Dは連続した値なので補間し、4棟あれば8変数です。手順は、まず各変数について計算済みの下側の値Lと上側の値Uを探し、その間のどこにいるかを t＝(x−L)÷(U−L) で求めます。</w:t>
-      </w:r>
-    </w:p>
-    <w:p>
-      <w:pPr>
-        <w:spacing w:after="100" w:line="360"/>
-      </w:pPr>
-      <w:r>
-        <w:rPr>
-          <w:rFonts w:ascii="Yu Gothic" w:cs="Yu Gothic" w:eastAsia="Yu Gothic" w:hAnsi="Yu Gothic"/>
-          <w:sz w:val="22"/>
-          <w:szCs w:val="22"/>
-        </w:rPr>
-        <w:t xml:space="preserve">南1棟では2変数なので4隅を使いましたが、4棟では8変数なので、周りの頂点は2の8乗の256個になります。下の式のΣは256個の頂点の結果を全部足す記号、Πは8つの変数の割合を掛け合わせる記号です。</w:t>
-      </w:r>
-    </w:p>
-    <w:p>
-      <w:pPr>
-        <w:spacing w:after="100" w:line="360"/>
-      </w:pPr>
-      <w:r>
-        <w:rPr>
-          <w:rFonts w:ascii="Yu Gothic" w:cs="Yu Gothic" w:eastAsia="Yu Gothic" w:hAnsi="Yu Gothic"/>
-          <w:sz w:val="22"/>
-          <w:szCs w:val="22"/>
-        </w:rPr>
-        <w:t xml:space="preserve">つまり、各変数の位置から重みを計算して、周りの256配置の日射量を重み付き平均する方法で、これを20個の出力それぞれで行います。変数を2つにすると、22枚目の4隅の式と同じになります。</w:t>
+        <w:t xml:space="preserve">読み上げ目安：約1.5分（467字）</w:t>
+      </w:r>
+    </w:p>
+    <w:p>
+      <w:pPr>
+        <w:spacing w:after="100" w:line="360"/>
+      </w:pPr>
+      <w:r>
+        <w:rPr>
+          <w:rFonts w:ascii="Yu Gothic" w:cs="Yu Gothic" w:eastAsia="Yu Gothic" w:hAnsi="Yu Gothic"/>
+          <w:sz w:val="22"/>
+          <w:szCs w:val="22"/>
+        </w:rPr>
+        <w:t xml:space="preserve">では、線形補間で4方向のツールを作ると、ツールの中でどんな計算をするかを、変数の数を増やしながら説明します。変数が1つなら、入力の両側にある2つの点を使います。t＝0.4の位置なら、下側を0.6、上側を0.4の割合で混ぜ、近い方を多く使います。</w:t>
+      </w:r>
+    </w:p>
+    <w:p>
+      <w:pPr>
+        <w:spacing w:after="100" w:line="360"/>
+      </w:pPr>
+      <w:r>
+        <w:rPr>
+          <w:rFonts w:ascii="Yu Gothic" w:cs="Yu Gothic" w:eastAsia="Yu Gothic" w:hAnsi="Yu Gothic"/>
+          <w:sz w:val="22"/>
+          <w:szCs w:val="22"/>
+        </w:rPr>
+        <w:t xml:space="preserve">変数が2つ、つまり今回の南1棟では、四角形の4隅を使い、隅の重みは2つの割合の掛け算です。変数が3つなら立方体の8つの角になります。このように、変数が1つ増えるごとに使う点は2倍になり、4棟の高さと隙間の8変数では、2を8回掛けた256点になります。</w:t>
+      </w:r>
+    </w:p>
+    <w:p>
+      <w:pPr>
+        <w:spacing w:after="100" w:line="360"/>
+      </w:pPr>
+      <w:r>
+        <w:rPr>
+          <w:rFonts w:ascii="Yu Gothic" w:cs="Yu Gothic" w:eastAsia="Yu Gothic" w:hAnsi="Yu Gothic"/>
+          <w:sz w:val="22"/>
+          <w:szCs w:val="22"/>
+        </w:rPr>
+        <w:t xml:space="preserve">考え方は南1棟と同じで、点の数が増えるだけです。ツールの中では、まず有無sを見て、16通りの組み合わせに合う表を選びます。次に各変数の位置tを求め、256点それぞれの重みを8つの割合の掛け算で出し、重み×保存値を256個足します。</w:t>
+      </w:r>
+    </w:p>
+    <w:p>
+      <w:pPr>
+        <w:spacing w:after="100" w:line="360"/>
+      </w:pPr>
+      <w:r>
+        <w:rPr>
+          <w:rFonts w:ascii="Yu Gothic" w:cs="Yu Gothic" w:eastAsia="Yu Gothic" w:hAnsi="Yu Gothic"/>
+          <w:sz w:val="22"/>
+          <w:szCs w:val="22"/>
+        </w:rPr>
+        <w:t xml:space="preserve">右下の式は、これを色分けして書いたもので、オレンジのΣが256点を全部足す、緑のΠqがその点の重み、黄色のyがその点の配置で保存したSEBEの日射量です。変数を2つにすると、22枚目の4隅の式と同じになります。</w:t>
       </w:r>
     </w:p>
     <w:p>

</xml_diff>